<commit_message>
Move diagrams to docs/design and update links
- Move the architecture, sequence and flow diagrams into docs/design/
  and rename them (kuwenta-aws-overview, kuwenta-sequence-diagram,
  kuwenta-flow)
- Update diagram links in the requirements (v1.7), tech stack (v1.1)
  and external APIs (v1.1) docs, and regenerate their Word copies

Co-Authored-By: Claude Opus 5.5 <noreply@anthropic.com>
</commit_message>
<xml_diff>
--- a/docs/kuwenta-external-apis.docx
+++ b/docs/kuwenta-external-apis.docx
@@ -270,7 +270,7 @@
                 <w:szCs w:val="18"/>
                 <w:rFonts w:ascii="Arial" w:cs="Arial" w:eastAsia="Arial" w:hAnsi="Arial"/>
               </w:rPr>
-              <w:t xml:space="preserve">1.0 (Draft)</w:t>
+              <w:t xml:space="preserve">1.1 (Draft) – diagram links updated</w:t>
             </w:r>
           </w:p>
         </w:tc>
@@ -444,7 +444,7 @@
                 <w:szCs w:val="18"/>
                 <w:rFonts w:ascii="Arial" w:cs="Arial" w:eastAsia="Arial" w:hAnsi="Arial"/>
               </w:rPr>
-              <w:t xml:space="preserve">kuwenta-requirements.md, kuwenta-tech-stack.md, kuwenta-sequence.drawio.svg</w:t>
+              <w:t xml:space="preserve">kuwenta-requirements.md, kuwenta-tech-stack.md, design/kuwenta-sequence-diagram.drawio.svg</w:t>
             </w:r>
           </w:p>
         </w:tc>
@@ -7118,7 +7118,7 @@
         <w:szCs w:val="16"/>
         <w:rFonts w:ascii="Arial" w:cs="Arial" w:eastAsia="Arial" w:hAnsi="Arial"/>
       </w:rPr>
-      <w:t xml:space="preserve">Kuwenta – External APIs v1.0    Page </w:t>
+      <w:t xml:space="preserve">Kuwenta – External APIs v1.1    Page </w:t>
     </w:r>
     <w:r>
       <w:rPr>

</xml_diff>